<commit_message>
ADO#2386 cycle 2 — C1 carrier normalization, C2 XML-escape wordml, I1 deductibles formattedValue, I2 fees column, I3 special_notes rendering
</commit_message>
<xml_diff>
--- a/services/proposal-generator/templates/lob-partials/commercial-property.docx
+++ b/services/proposal-generator/templates/lob-partials/commercial-property.docx
@@ -297,7 +297,7 @@
               <w:keepNext/>
             </w:pPr>
             <w:r>
-              <w:t>Description</w:t>
+              <w:t>Details</w:t>
             </w:r>
           </w:p>
         </w:tc>
@@ -325,7 +325,7 @@
               <w:keepLines/>
             </w:pPr>
             <w:r>
-              <w:t>{description}{/deductibles}</w:t>
+              <w:t>{formattedValue}{/deductibles}</w:t>
             </w:r>
           </w:p>
         </w:tc>

</xml_diff>

<commit_message>
feat(proposal-generator#2391): document formatting overhaul — section reorder, horizontal grids, blue header shading
- Reorder master template: Premium Summary + Market Response before Executive Summary
- Replace Word field-code TOC with manual paragraph list
- Add set_cell_shading() + HEADER_BG constant; update apply_table_formatting() with blue header shading + bold
- Update add_carrier_info_table() to shade label column blue + bold labels
- WC template: replace vertical card schedule with horizontal 6-col grid using {#wcEmployeeClasses}
- GL template: replace add_schedule_section() with horizontal Location table ({#scheduleLocations}) + Basis of Premium table ({#glClassifications})
- lobRenderer: add formatCurrency helper; replace buildScheduleItems() with buildScheduleLocations(), buildGlClassifications(), buildWcEmployeeClasses()
- Regenerate all .docx templates; upload to S3

Co-Authored-By: Claude Sonnet 4.6 <noreply@anthropic.com>
</commit_message>
<xml_diff>
--- a/services/proposal-generator/templates/lob-partials/commercial-property.docx
+++ b/services/proposal-generator/templates/lob-partials/commercial-property.docx
@@ -24,6 +24,7 @@
         <w:tc>
           <w:tcPr>
             <w:tcW w:type="dxa" w:w="4320"/>
+            <w:shd w:val="clear" w:color="auto" w:fill="BDD7EE"/>
           </w:tcPr>
           <w:p>
             <w:pPr>
@@ -31,6 +32,9 @@
               <w:keepNext/>
             </w:pPr>
             <w:r>
+              <w:rPr>
+                <w:b/>
+              </w:rPr>
               <w:t>Carrier</w:t>
             </w:r>
           </w:p>
@@ -54,6 +58,7 @@
         <w:tc>
           <w:tcPr>
             <w:tcW w:type="dxa" w:w="4320"/>
+            <w:shd w:val="clear" w:color="auto" w:fill="BDD7EE"/>
           </w:tcPr>
           <w:p>
             <w:pPr>
@@ -61,6 +66,9 @@
               <w:keepNext/>
             </w:pPr>
             <w:r>
+              <w:rPr>
+                <w:b/>
+              </w:rPr>
               <w:t>AM Best Rating</w:t>
             </w:r>
           </w:p>
@@ -84,6 +92,7 @@
         <w:tc>
           <w:tcPr>
             <w:tcW w:type="dxa" w:w="4320"/>
+            <w:shd w:val="clear" w:color="auto" w:fill="BDD7EE"/>
           </w:tcPr>
           <w:p>
             <w:pPr>
@@ -91,6 +100,9 @@
               <w:keepNext/>
             </w:pPr>
             <w:r>
+              <w:rPr>
+                <w:b/>
+              </w:rPr>
               <w:t>Admitted/Surplus</w:t>
             </w:r>
           </w:p>
@@ -114,6 +126,7 @@
         <w:tc>
           <w:tcPr>
             <w:tcW w:type="dxa" w:w="4320"/>
+            <w:shd w:val="clear" w:color="auto" w:fill="BDD7EE"/>
           </w:tcPr>
           <w:p>
             <w:pPr>
@@ -121,6 +134,9 @@
               <w:keepNext/>
             </w:pPr>
             <w:r>
+              <w:rPr>
+                <w:b/>
+              </w:rPr>
               <w:t>Quote #</w:t>
             </w:r>
           </w:p>
@@ -144,12 +160,16 @@
         <w:tc>
           <w:tcPr>
             <w:tcW w:type="dxa" w:w="4320"/>
+            <w:shd w:val="clear" w:color="auto" w:fill="BDD7EE"/>
           </w:tcPr>
           <w:p>
             <w:pPr>
               <w:keepLines/>
             </w:pPr>
             <w:r>
+              <w:rPr>
+                <w:b/>
+              </w:rPr>
               <w:t>Policy #</w:t>
             </w:r>
           </w:p>
@@ -195,6 +215,7 @@
         <w:tc>
           <w:tcPr>
             <w:tcW w:type="dxa" w:w="4320"/>
+            <w:shd w:val="clear" w:color="auto" w:fill="BDD7EE"/>
           </w:tcPr>
           <w:p>
             <w:pPr>
@@ -202,6 +223,9 @@
               <w:keepNext/>
             </w:pPr>
             <w:r>
+              <w:rPr>
+                <w:b/>
+              </w:rPr>
               <w:t>Coverage</w:t>
             </w:r>
           </w:p>
@@ -209,6 +233,7 @@
         <w:tc>
           <w:tcPr>
             <w:tcW w:type="dxa" w:w="4320"/>
+            <w:shd w:val="clear" w:color="auto" w:fill="BDD7EE"/>
           </w:tcPr>
           <w:p>
             <w:pPr>
@@ -216,6 +241,9 @@
               <w:keepNext/>
             </w:pPr>
             <w:r>
+              <w:rPr>
+                <w:b/>
+              </w:rPr>
               <w:t>Limit</w:t>
             </w:r>
           </w:p>
@@ -276,6 +304,7 @@
         <w:tc>
           <w:tcPr>
             <w:tcW w:type="dxa" w:w="4320"/>
+            <w:shd w:val="clear" w:color="auto" w:fill="BDD7EE"/>
           </w:tcPr>
           <w:p>
             <w:pPr>
@@ -283,6 +312,9 @@
               <w:keepNext/>
             </w:pPr>
             <w:r>
+              <w:rPr>
+                <w:b/>
+              </w:rPr>
               <w:t>Deductible Type</w:t>
             </w:r>
           </w:p>
@@ -290,6 +322,7 @@
         <w:tc>
           <w:tcPr>
             <w:tcW w:type="dxa" w:w="4320"/>
+            <w:shd w:val="clear" w:color="auto" w:fill="BDD7EE"/>
           </w:tcPr>
           <w:p>
             <w:pPr>
@@ -297,6 +330,9 @@
               <w:keepNext/>
             </w:pPr>
             <w:r>
+              <w:rPr>
+                <w:b/>
+              </w:rPr>
               <w:t>Details</w:t>
             </w:r>
           </w:p>
@@ -370,6 +406,7 @@
         <w:tc>
           <w:tcPr>
             <w:tcW w:type="dxa" w:w="4320"/>
+            <w:shd w:val="clear" w:color="auto" w:fill="BDD7EE"/>
           </w:tcPr>
           <w:p>
             <w:pPr>
@@ -377,6 +414,9 @@
               <w:keepNext/>
             </w:pPr>
             <w:r>
+              <w:rPr>
+                <w:b/>
+              </w:rPr>
               <w:t>Field</w:t>
             </w:r>
           </w:p>
@@ -384,6 +424,7 @@
         <w:tc>
           <w:tcPr>
             <w:tcW w:type="dxa" w:w="4320"/>
+            <w:shd w:val="clear" w:color="auto" w:fill="BDD7EE"/>
           </w:tcPr>
           <w:p>
             <w:pPr>
@@ -391,6 +432,9 @@
               <w:keepNext/>
             </w:pPr>
             <w:r>
+              <w:rPr>
+                <w:b/>
+              </w:rPr>
               <w:t>Value</w:t>
             </w:r>
           </w:p>
@@ -456,6 +500,7 @@
         <w:tc>
           <w:tcPr>
             <w:tcW w:type="dxa" w:w="4320"/>
+            <w:shd w:val="clear" w:color="auto" w:fill="BDD7EE"/>
           </w:tcPr>
           <w:p>
             <w:pPr>
@@ -463,6 +508,9 @@
               <w:keepNext/>
             </w:pPr>
             <w:r>
+              <w:rPr>
+                <w:b/>
+              </w:rPr>
               <w:t>Field</w:t>
             </w:r>
           </w:p>
@@ -470,6 +518,7 @@
         <w:tc>
           <w:tcPr>
             <w:tcW w:type="dxa" w:w="4320"/>
+            <w:shd w:val="clear" w:color="auto" w:fill="BDD7EE"/>
           </w:tcPr>
           <w:p>
             <w:pPr>
@@ -477,6 +526,9 @@
               <w:keepNext/>
             </w:pPr>
             <w:r>
+              <w:rPr>
+                <w:b/>
+              </w:rPr>
               <w:t>Value</w:t>
             </w:r>
           </w:p>
@@ -547,6 +599,7 @@
         <w:tc>
           <w:tcPr>
             <w:tcW w:type="dxa" w:w="4320"/>
+            <w:shd w:val="clear" w:color="auto" w:fill="BDD7EE"/>
           </w:tcPr>
           <w:p>
             <w:pPr>
@@ -554,6 +607,9 @@
               <w:keepNext/>
             </w:pPr>
             <w:r>
+              <w:rPr>
+                <w:b/>
+              </w:rPr>
               <w:t>Form #</w:t>
             </w:r>
           </w:p>
@@ -561,6 +617,7 @@
         <w:tc>
           <w:tcPr>
             <w:tcW w:type="dxa" w:w="4320"/>
+            <w:shd w:val="clear" w:color="auto" w:fill="BDD7EE"/>
           </w:tcPr>
           <w:p>
             <w:pPr>
@@ -568,6 +625,9 @@
               <w:keepNext/>
             </w:pPr>
             <w:r>
+              <w:rPr>
+                <w:b/>
+              </w:rPr>
               <w:t>Endorsement</w:t>
             </w:r>
           </w:p>

</xml_diff>

<commit_message>
chore(proposal-generator#2393): regenerate templates — banners, unified premium table, property schedule grid
</commit_message>
<xml_diff>
--- a/services/proposal-generator/templates/lob-partials/commercial-property.docx
+++ b/services/proposal-generator/templates/lob-partials/commercial-property.docx
@@ -2,193 +2,160 @@
 <file path=word/document.xml><?xml version="1.0" encoding="utf-8"?>
 <w:document xmlns:wpc="http://schemas.microsoft.com/office/word/2010/wordprocessingCanvas" xmlns:mo="http://schemas.microsoft.com/office/mac/office/2008/main" xmlns:mc="http://schemas.openxmlformats.org/markup-compatibility/2006" xmlns:mv="urn:schemas-microsoft-com:mac:vml" xmlns:o="urn:schemas-microsoft-com:office:office" xmlns:r="http://schemas.openxmlformats.org/officeDocument/2006/relationships" xmlns:m="http://schemas.openxmlformats.org/officeDocument/2006/math" xmlns:v="urn:schemas-microsoft-com:vml" xmlns:wp14="http://schemas.microsoft.com/office/word/2010/wordprocessingDrawing" xmlns:wp="http://schemas.openxmlformats.org/drawingml/2006/wordprocessingDrawing" xmlns:w10="urn:schemas-microsoft-com:office:word" xmlns:w="http://schemas.openxmlformats.org/wordprocessingml/2006/main" xmlns:w14="http://schemas.microsoft.com/office/word/2010/wordml" xmlns:wpg="http://schemas.microsoft.com/office/word/2010/wordprocessingGroup" xmlns:wpi="http://schemas.microsoft.com/office/word/2010/wordprocessingInk" xmlns:wne="http://schemas.microsoft.com/office/word/2006/wordml" xmlns:wps="http://schemas.microsoft.com/office/word/2010/wordprocessingShape" mc:Ignorable="w14 wp14">
   <w:body>
-    <w:p>
-      <w:pPr>
-        <w:pStyle w:val="Heading1"/>
-      </w:pPr>
-      <w:r>
-        <w:t>{sectionTitle}</w:t>
-      </w:r>
-    </w:p>
     <w:tbl>
       <w:tblPr>
         <w:tblStyle w:val="TableGrid"/>
         <w:tblW w:type="auto" w:w="0"/>
         <w:tblLook w:firstColumn="1" w:firstRow="1" w:lastColumn="0" w:lastRow="0" w:noHBand="0" w:noVBand="1" w:val="04A0"/>
+        <w:tblW w:w="8640" w:type="dxa"/>
       </w:tblPr>
       <w:tblGrid>
-        <w:gridCol w:w="4320"/>
-        <w:gridCol w:w="4320"/>
+        <w:gridCol w:w="8640"/>
       </w:tblGrid>
       <w:tr>
         <w:tc>
           <w:tcPr>
-            <w:tcW w:type="dxa" w:w="4320"/>
-            <w:shd w:val="clear" w:color="auto" w:fill="BDD7EE"/>
+            <w:tcW w:type="dxa" w:w="8640"/>
+            <w:shd w:val="clear" w:color="auto" w:fill="1F3864"/>
+            <w:tcW w:w="8640" w:type="dxa"/>
           </w:tcPr>
           <w:p>
             <w:pPr>
-              <w:keepLines/>
-              <w:keepNext/>
+              <w:spacing w:before="80" w:after="80"/>
             </w:pPr>
             <w:r>
               <w:rPr>
                 <w:b/>
+                <w:color w:val="FFFFFF"/>
+                <w:sz w:val="28"/>
               </w:rPr>
-              <w:t>Carrier</w:t>
-            </w:r>
-          </w:p>
-        </w:tc>
-        <w:tc>
-          <w:tcPr>
-            <w:tcW w:type="dxa" w:w="4320"/>
-          </w:tcPr>
-          <w:p>
-            <w:pPr>
-              <w:keepLines/>
-              <w:keepNext/>
-            </w:pPr>
-            <w:r>
-              <w:t>{carrier.name}</w:t>
-            </w:r>
-          </w:p>
-        </w:tc>
-      </w:tr>
-      <w:tr>
-        <w:tc>
-          <w:tcPr>
-            <w:tcW w:type="dxa" w:w="4320"/>
-            <w:shd w:val="clear" w:color="auto" w:fill="BDD7EE"/>
-          </w:tcPr>
-          <w:p>
-            <w:pPr>
-              <w:keepLines/>
-              <w:keepNext/>
-            </w:pPr>
-            <w:r>
-              <w:rPr>
-                <w:b/>
-              </w:rPr>
-              <w:t>AM Best Rating</w:t>
-            </w:r>
-          </w:p>
-        </w:tc>
-        <w:tc>
-          <w:tcPr>
-            <w:tcW w:type="dxa" w:w="4320"/>
-          </w:tcPr>
-          <w:p>
-            <w:pPr>
-              <w:keepLines/>
-              <w:keepNext/>
-            </w:pPr>
-            <w:r>
-              <w:t>{carrier.amBestRating}</w:t>
-            </w:r>
-          </w:p>
-        </w:tc>
-      </w:tr>
-      <w:tr>
-        <w:tc>
-          <w:tcPr>
-            <w:tcW w:type="dxa" w:w="4320"/>
-            <w:shd w:val="clear" w:color="auto" w:fill="BDD7EE"/>
-          </w:tcPr>
-          <w:p>
-            <w:pPr>
-              <w:keepLines/>
-              <w:keepNext/>
-            </w:pPr>
-            <w:r>
-              <w:rPr>
-                <w:b/>
-              </w:rPr>
-              <w:t>Admitted/Surplus</w:t>
-            </w:r>
-          </w:p>
-        </w:tc>
-        <w:tc>
-          <w:tcPr>
-            <w:tcW w:type="dxa" w:w="4320"/>
-          </w:tcPr>
-          <w:p>
-            <w:pPr>
-              <w:keepLines/>
-              <w:keepNext/>
-            </w:pPr>
-            <w:r>
-              <w:t>{#isAdmitted}Admitted{/isAdmitted}{^isAdmitted}Surplus Lines{/isAdmitted}</w:t>
-            </w:r>
-          </w:p>
-        </w:tc>
-      </w:tr>
-      <w:tr>
-        <w:tc>
-          <w:tcPr>
-            <w:tcW w:type="dxa" w:w="4320"/>
-            <w:shd w:val="clear" w:color="auto" w:fill="BDD7EE"/>
-          </w:tcPr>
-          <w:p>
-            <w:pPr>
-              <w:keepLines/>
-              <w:keepNext/>
-            </w:pPr>
-            <w:r>
-              <w:rPr>
-                <w:b/>
-              </w:rPr>
-              <w:t>Quote #</w:t>
-            </w:r>
-          </w:p>
-        </w:tc>
-        <w:tc>
-          <w:tcPr>
-            <w:tcW w:type="dxa" w:w="4320"/>
-          </w:tcPr>
-          <w:p>
-            <w:pPr>
-              <w:keepLines/>
-              <w:keepNext/>
-            </w:pPr>
-            <w:r>
-              <w:t>{#quoteNumber}{quoteNumber}{/quoteNumber}{^quoteNumber}—{/quoteNumber}</w:t>
-            </w:r>
-          </w:p>
-        </w:tc>
-      </w:tr>
-      <w:tr>
-        <w:tc>
-          <w:tcPr>
-            <w:tcW w:type="dxa" w:w="4320"/>
-            <w:shd w:val="clear" w:color="auto" w:fill="BDD7EE"/>
-          </w:tcPr>
-          <w:p>
-            <w:pPr>
-              <w:keepLines/>
-            </w:pPr>
-            <w:r>
-              <w:rPr>
-                <w:b/>
-              </w:rPr>
-              <w:t>Policy #</w:t>
-            </w:r>
-          </w:p>
-        </w:tc>
-        <w:tc>
-          <w:tcPr>
-            <w:tcW w:type="dxa" w:w="4320"/>
-          </w:tcPr>
-          <w:p>
-            <w:pPr>
-              <w:keepLines/>
-            </w:pPr>
-            <w:r>
-              <w:t>{#policyNumber}{policyNumber}{/policyNumber}{^policyNumber}—{/policyNumber}</w:t>
+              <w:t>{SECTIONTITLE}</w:t>
             </w:r>
           </w:p>
         </w:tc>
       </w:tr>
     </w:tbl>
+    <w:p>
+      <w:pPr>
+        <w:spacing w:after="40"/>
+      </w:pPr>
+      <w:r>
+        <w:rPr>
+          <w:b/>
+          <w:sz w:val="20"/>
+        </w:rPr>
+        <w:t xml:space="preserve">CARRIER    </w:t>
+      </w:r>
+      <w:r>
+        <w:rPr>
+          <w:b w:val="0"/>
+          <w:sz w:val="20"/>
+        </w:rPr>
+        <w:t>{carrier.name}</w:t>
+      </w:r>
+    </w:p>
+    <w:p>
+      <w:pPr>
+        <w:spacing w:after="40"/>
+      </w:pPr>
+      <w:r>
+        <w:rPr>
+          <w:b/>
+          <w:sz w:val="20"/>
+        </w:rPr>
+        <w:t xml:space="preserve">A.M. BEST RATING    </w:t>
+      </w:r>
+      <w:r>
+        <w:rPr>
+          <w:b w:val="0"/>
+          <w:sz w:val="20"/>
+        </w:rPr>
+        <w:t>{carrier.amBestRating}</w:t>
+      </w:r>
+    </w:p>
+    <w:p>
+      <w:pPr>
+        <w:spacing w:after="40"/>
+      </w:pPr>
+      <w:r>
+        <w:rPr>
+          <w:b/>
+          <w:sz w:val="20"/>
+        </w:rPr>
+        <w:t xml:space="preserve">POLICY PERIOD    </w:t>
+      </w:r>
+      <w:r>
+        <w:rPr>
+          <w:b w:val="0"/>
+          <w:sz w:val="20"/>
+        </w:rPr>
+        <w:t>{effectiveDate} — {expirationDate}</w:t>
+      </w:r>
+    </w:p>
+    <w:p>
+      <w:pPr>
+        <w:spacing w:after="40"/>
+      </w:pPr>
+      <w:r>
+        <w:rPr>
+          <w:b/>
+          <w:sz w:val="20"/>
+        </w:rPr>
+        <w:t xml:space="preserve">COVERAGE    </w:t>
+      </w:r>
+      <w:r>
+        <w:rPr>
+          <w:b w:val="0"/>
+          <w:sz w:val="20"/>
+        </w:rPr>
+        <w:t>{sectionTitle}</w:t>
+      </w:r>
+    </w:p>
+    <w:p>
+      <w:pPr>
+        <w:spacing w:after="40"/>
+      </w:pPr>
+      <w:r>
+        <w:rPr>
+          <w:b/>
+          <w:sz w:val="20"/>
+        </w:rPr>
+        <w:t xml:space="preserve">POLICY #    </w:t>
+      </w:r>
+      <w:r>
+        <w:rPr>
+          <w:b w:val="0"/>
+          <w:sz w:val="20"/>
+        </w:rPr>
+        <w:t>{#policyNumber}{policyNumber}{/policyNumber}{^policyNumber}—{/policyNumber}</w:t>
+      </w:r>
+    </w:p>
+    <w:p>
+      <w:pPr>
+        <w:pStyle w:val="Heading3"/>
+      </w:pPr>
+      <w:r>
+        <w:t>Named Insured</w:t>
+      </w:r>
+    </w:p>
+    <w:p>
+      <w:r>
+        <w:t>{#namedInsureds}</w:t>
+      </w:r>
+    </w:p>
+    <w:p>
+      <w:pPr>
+        <w:pStyle w:val="ListBullet"/>
+      </w:pPr>
+      <w:r>
+        <w:t>• {name}</w:t>
+      </w:r>
+    </w:p>
+    <w:p>
+      <w:r>
+        <w:t>{/namedInsureds}</w:t>
+      </w:r>
+    </w:p>
     <w:p>
       <w:pPr>
         <w:pStyle w:val="Heading2"/>
@@ -375,19 +342,6 @@
         <w:t>Location / Building Schedule</w:t>
       </w:r>
     </w:p>
-    <w:p>
-      <w:r>
-        <w:t>{#scheduleItems}</w:t>
-      </w:r>
-    </w:p>
-    <w:p>
-      <w:pPr>
-        <w:pStyle w:val="Heading3"/>
-      </w:pPr>
-      <w:r>
-        <w:t>Item {itemNumber}: {description}</w:t>
-      </w:r>
-    </w:p>
     <w:tbl>
       <w:tblPr>
         <w:tblStyle w:val="TableGrid"/>
@@ -395,8 +349,11 @@
         <w:tblLook w:firstColumn="1" w:firstRow="1" w:lastColumn="0" w:lastRow="0" w:noHBand="0" w:noVBand="1" w:val="04A0"/>
       </w:tblPr>
       <w:tblGrid>
-        <w:gridCol w:w="4320"/>
-        <w:gridCol w:w="4320"/>
+        <w:gridCol w:w="1728"/>
+        <w:gridCol w:w="1728"/>
+        <w:gridCol w:w="1728"/>
+        <w:gridCol w:w="1728"/>
+        <w:gridCol w:w="1728"/>
       </w:tblGrid>
       <w:tr>
         <w:trPr>
@@ -405,7 +362,7 @@
         </w:trPr>
         <w:tc>
           <w:tcPr>
-            <w:tcW w:type="dxa" w:w="4320"/>
+            <w:tcW w:type="dxa" w:w="1728"/>
             <w:shd w:val="clear" w:color="auto" w:fill="BDD7EE"/>
           </w:tcPr>
           <w:p>
@@ -417,13 +374,13 @@
               <w:rPr>
                 <w:b/>
               </w:rPr>
-              <w:t>Field</w:t>
+              <w:t>Location #</w:t>
             </w:r>
           </w:p>
         </w:tc>
         <w:tc>
           <w:tcPr>
-            <w:tcW w:type="dxa" w:w="4320"/>
+            <w:tcW w:type="dxa" w:w="1728"/>
             <w:shd w:val="clear" w:color="auto" w:fill="BDD7EE"/>
           </w:tcPr>
           <w:p>
@@ -435,71 +392,13 @@
               <w:rPr>
                 <w:b/>
               </w:rPr>
-              <w:t>Value</w:t>
-            </w:r>
-          </w:p>
-        </w:tc>
-      </w:tr>
-      <w:tr>
-        <w:tc>
-          <w:tcPr>
-            <w:tcW w:type="dxa" w:w="4320"/>
-          </w:tcPr>
-          <w:p>
-            <w:pPr>
-              <w:keepLines/>
-            </w:pPr>
-            <w:r>
-              <w:t>{#formattedAttributes}{label}</w:t>
+              <w:t>Building #</w:t>
             </w:r>
           </w:p>
         </w:tc>
         <w:tc>
           <w:tcPr>
-            <w:tcW w:type="dxa" w:w="4320"/>
-          </w:tcPr>
-          <w:p>
-            <w:pPr>
-              <w:keepLines/>
-            </w:pPr>
-            <w:r>
-              <w:t>{formattedValue}{/formattedAttributes}</w:t>
-            </w:r>
-          </w:p>
-        </w:tc>
-      </w:tr>
-    </w:tbl>
-    <w:p>
-      <w:r>
-        <w:t>{#children}</w:t>
-      </w:r>
-    </w:p>
-    <w:p>
-      <w:pPr>
-        <w:pStyle w:val="Heading4"/>
-      </w:pPr>
-      <w:r>
-        <w:t>Sub-item {itemNumber}: {description}</w:t>
-      </w:r>
-    </w:p>
-    <w:tbl>
-      <w:tblPr>
-        <w:tblStyle w:val="TableGrid"/>
-        <w:tblW w:type="auto" w:w="0"/>
-        <w:tblLook w:firstColumn="1" w:firstRow="1" w:lastColumn="0" w:lastRow="0" w:noHBand="0" w:noVBand="1" w:val="04A0"/>
-      </w:tblPr>
-      <w:tblGrid>
-        <w:gridCol w:w="4320"/>
-        <w:gridCol w:w="4320"/>
-      </w:tblGrid>
-      <w:tr>
-        <w:trPr>
-          <w:tblHeader/>
-          <w:tblHeader/>
-        </w:trPr>
-        <w:tc>
-          <w:tcPr>
-            <w:tcW w:type="dxa" w:w="4320"/>
+            <w:tcW w:type="dxa" w:w="1728"/>
             <w:shd w:val="clear" w:color="auto" w:fill="BDD7EE"/>
           </w:tcPr>
           <w:p>
@@ -511,13 +410,13 @@
               <w:rPr>
                 <w:b/>
               </w:rPr>
-              <w:t>Field</w:t>
+              <w:t>Description</w:t>
             </w:r>
           </w:p>
         </w:tc>
         <w:tc>
           <w:tcPr>
-            <w:tcW w:type="dxa" w:w="4320"/>
+            <w:tcW w:type="dxa" w:w="1728"/>
             <w:shd w:val="clear" w:color="auto" w:fill="BDD7EE"/>
           </w:tcPr>
           <w:p>
@@ -529,7 +428,25 @@
               <w:rPr>
                 <w:b/>
               </w:rPr>
-              <w:t>Value</w:t>
+              <w:t>Address</w:t>
+            </w:r>
+          </w:p>
+        </w:tc>
+        <w:tc>
+          <w:tcPr>
+            <w:tcW w:type="dxa" w:w="1728"/>
+            <w:shd w:val="clear" w:color="auto" w:fill="BDD7EE"/>
+          </w:tcPr>
+          <w:p>
+            <w:pPr>
+              <w:keepLines/>
+              <w:keepNext/>
+            </w:pPr>
+            <w:r>
+              <w:rPr>
+                <w:b/>
+              </w:rPr>
+              <w:t>Building Limit</w:t>
             </w:r>
           </w:p>
         </w:tc>
@@ -537,42 +454,71 @@
       <w:tr>
         <w:tc>
           <w:tcPr>
-            <w:tcW w:type="dxa" w:w="4320"/>
+            <w:tcW w:type="dxa" w:w="1728"/>
           </w:tcPr>
           <w:p>
             <w:pPr>
               <w:keepLines/>
             </w:pPr>
             <w:r>
-              <w:t>{#formattedAttributes}{label}</w:t>
+              <w:t>{#propertySchedule}{locationNumber}</w:t>
             </w:r>
           </w:p>
         </w:tc>
         <w:tc>
           <w:tcPr>
-            <w:tcW w:type="dxa" w:w="4320"/>
+            <w:tcW w:type="dxa" w:w="1728"/>
           </w:tcPr>
           <w:p>
             <w:pPr>
               <w:keepLines/>
             </w:pPr>
             <w:r>
-              <w:t>{formattedValue}{/formattedAttributes}</w:t>
+              <w:t>{buildingNumber}</w:t>
+            </w:r>
+          </w:p>
+        </w:tc>
+        <w:tc>
+          <w:tcPr>
+            <w:tcW w:type="dxa" w:w="1728"/>
+          </w:tcPr>
+          <w:p>
+            <w:pPr>
+              <w:keepLines/>
+            </w:pPr>
+            <w:r>
+              <w:t>{description}</w:t>
+            </w:r>
+          </w:p>
+        </w:tc>
+        <w:tc>
+          <w:tcPr>
+            <w:tcW w:type="dxa" w:w="1728"/>
+          </w:tcPr>
+          <w:p>
+            <w:pPr>
+              <w:keepLines/>
+            </w:pPr>
+            <w:r>
+              <w:t>{address}</w:t>
+            </w:r>
+          </w:p>
+        </w:tc>
+        <w:tc>
+          <w:tcPr>
+            <w:tcW w:type="dxa" w:w="1728"/>
+          </w:tcPr>
+          <w:p>
+            <w:pPr>
+              <w:keepLines/>
+            </w:pPr>
+            <w:r>
+              <w:t>{buildingLimit}{/propertySchedule}</w:t>
             </w:r>
           </w:p>
         </w:tc>
       </w:tr>
     </w:tbl>
-    <w:p>
-      <w:r>
-        <w:t>{/children}</w:t>
-      </w:r>
-    </w:p>
-    <w:p>
-      <w:r>
-        <w:t>{/scheduleItems}</w:t>
-      </w:r>
-    </w:p>
     <w:p>
       <w:pPr>
         <w:pStyle w:val="Heading2"/>

</xml_diff>

<commit_message>
feat(proposal-generator): ADO#2395 — replace static TOC with Word PAGEREF field codes
- Add dot-leader tab stop helpers (add_dot_leader_tab, add_pageref_field, add_toc_entry)
- Add bookmark helper (add_bookmark) with counter-based unique IDs
- Replace static TOC in master template with 10 PAGEREF field code entries
- Add bookmarks at all 7 major section headings/banners in master template
- Inject LOB bookmarks into partial XML via injectLobBookmark() in lobRenderer.js
- Confirm w:updateFields present via existing inject_update_fields()
- Regenerate all templates + S3 sync
</commit_message>
<xml_diff>
--- a/services/proposal-generator/templates/lob-partials/commercial-property.docx
+++ b/services/proposal-generator/templates/lob-partials/commercial-property.docx
@@ -29,7 +29,7 @@
                 <w:color w:val="FFFFFF"/>
                 <w:sz w:val="28"/>
               </w:rPr>
-              <w:t>{SECTIONTITLE}</w:t>
+              <w:t>{sectionTitle}</w:t>
             </w:r>
           </w:p>
         </w:tc>
@@ -148,7 +148,7 @@
         <w:pStyle w:val="ListBullet"/>
       </w:pPr>
       <w:r>
-        <w:t>• {name}</w:t>
+        <w:t>{name}</w:t>
       </w:r>
     </w:p>
     <w:p>

</xml_diff>